<commit_message>
ajuste da explicabilidade dos calcululos
</commit_message>
<xml_diff>
--- a/fase2/Alteracoes_Relatorio_v1_para_v2.docx
+++ b/fase2/Alteracoes_Relatorio_v1_para_v2.docx
@@ -21,7 +21,7 @@
           <w:color w:val="52514E"/>
           <w:sz w:val="19"/>
         </w:rPr>
-        <w:t>Documento de apoio ao grupo. Compara o relatório entregue na Fase 1 (fase1/Relatorio_Executivo_Fase1_Olist_FINAL.pdf, 17 páginas) com a versão 2.0 (fase2/Relatorio_Executivo_Fase2_Olist_RASCUNHO.pdf, 26 páginas). A coluna "pág. v2" indica onde a seção está na versão 2.0.</w:t>
+        <w:t>Documento de apoio ao grupo. Compara o relatório entregue na Fase 1 (fase1/Relatorio_Executivo_Fase1_Olist_FINAL.pdf, 17 páginas) com a versão 2.0 (fase2/Relatorio_Executivo_Fase2_Olist_RASCUNHO.pdf, 28 páginas). A coluna "pág. v2" indica onde a seção está na versão 2.0.</w:t>
       </w:r>
     </w:p>
     <w:p>
@@ -2072,7 +2072,7 @@
                 <w:b w:val="0"/>
                 <w:sz w:val="16"/>
               </w:rPr>
-              <w:t>Cenário base: 670 atrasos evitados, 1.229 h poupadas (R$ 55 mil), 358 2ªs compras (R$ 53 mil)</w:t>
+              <w:t>Cenário base: 672 atrasos evitados, 1.230 h poupadas (R$ 55 mil), 358 2ªs compras (R$ 53 mil), com memória de cálculo na Seção 13.4</w:t>
             </w:r>
           </w:p>
         </w:tc>
@@ -6911,7 +6911,7 @@
                 <w:b w:val="0"/>
                 <w:sz w:val="16"/>
               </w:rPr>
-              <w:t>13.2 e 13.3</w:t>
+              <w:t>13.2 a 13.4</w:t>
             </w:r>
           </w:p>
         </w:tc>
@@ -6947,7 +6947,21 @@
                 <w:b w:val="0"/>
                 <w:sz w:val="16"/>
               </w:rPr>
-              <w:t>Metas do piloto + business case em 3 cenários</w:t>
+              <w:t xml:space="preserve">Metas do piloto + business case em 3 cenários + </w:t>
+            </w:r>
+            <w:r>
+              <w:rPr>
+                <w:b/>
+                <w:sz w:val="16"/>
+              </w:rPr>
+              <w:t>memória de cálculo</w:t>
+            </w:r>
+            <w:r>
+              <w:rPr>
+                <w:b w:val="0"/>
+                <w:sz w:val="16"/>
+              </w:rPr>
+              <w:t xml:space="preserve"> (cada entrada, fórmula e conta)</w:t>
             </w:r>
           </w:p>
         </w:tc>
@@ -6978,7 +6992,7 @@
           <w:color w:val="1F3A5F"/>
           <w:sz w:val="21"/>
         </w:rPr>
-        <w:t xml:space="preserve">   ·   pág. v2: 25</w:t>
+        <w:t xml:space="preserve">   ·   pág. v2: 27</w:t>
       </w:r>
     </w:p>
     <w:tbl>
@@ -7262,7 +7276,7 @@
           <w:color w:val="1F3A5F"/>
           <w:sz w:val="21"/>
         </w:rPr>
-        <w:t xml:space="preserve">   ·   pág. v2: 26</w:t>
+        <w:t xml:space="preserve">   ·   pág. v2: 28</w:t>
       </w:r>
     </w:p>
     <w:tbl>

</xml_diff>

<commit_message>
Versao final do relatorio da Fase 2 com ajustes do Leo
- Link do video da Fase 2 inserido (config_relatorio.json); versao FINAL
  gerada: fase2/Relatorio_Executivo_Fase2_Olist_FINAL.pdf e .docx
  (29 paginas, QA final OK, link clicavel na capa e no Sumario).
- Ajustes do Leo (dono do Sumario), para precisao metodologica:
  - 13.4 LogiPredict: redacao sem afirmar causalidade (20 p.p. a mais de
    atraso; reducao parcial como hipotese a validar no piloto).
  - 13.2 Metas: Nordeste 14,3% como referencia historica; meta = -1 p.p.
    sobre o baseline das rotas selecionadas, comparada ao controle.
- Docs de apoio regerados com as paginas do PDF final; PLANO atualizado.

Co-Authored-By: Claude Opus 5.5 <noreply@anthropic.com>
</commit_message>
<xml_diff>
--- a/fase2/Alteracoes_Relatorio_v1_para_v2.docx
+++ b/fase2/Alteracoes_Relatorio_v1_para_v2.docx
@@ -21,7 +21,7 @@
           <w:color w:val="52514E"/>
           <w:sz w:val="19"/>
         </w:rPr>
-        <w:t>Documento de apoio ao grupo. Compara o relatório entregue na Fase 1 (fase1/Relatorio_Executivo_Fase1_Olist_FINAL.pdf, 17 páginas) com a versão 2.1 (fase2/Relatorio_Executivo_Fase2_Olist_RASCUNHO.pdf, 29 páginas). A coluna "pág. v2" indica onde a seção está na versão 2.1.</w:t>
+        <w:t>Documento de apoio ao grupo. Compara o relatório entregue na Fase 1 (fase1/Relatorio_Executivo_Fase1_Olist_FINAL.pdf, 17 páginas) com a versão 2.1 (fase2/Relatorio_Executivo_Fase2_Olist_FINAL.pdf, 29 páginas). A coluna "pág. v2" indica onde a seção está na versão 2.1.</w:t>
       </w:r>
     </w:p>
     <w:p>
@@ -1114,7 +1114,7 @@
                 <w:b w:val="0"/>
                 <w:sz w:val="17"/>
               </w:rPr>
-              <w:t>Agregado dos 9 estados calculado no notebook 08; meta −1 p.p. (13,3%)</w:t>
+              <w:t>Agregado dos 9 estados calculado no notebook 08 (referência histórica); meta = −1 p.p. sobre o baseline das rotas selecionadas, contra controle</w:t>
             </w:r>
           </w:p>
         </w:tc>
@@ -7533,7 +7533,7 @@
                 <w:b w:val="0"/>
                 <w:sz w:val="16"/>
               </w:rPr>
-              <w:t xml:space="preserve">Metas do piloto (Nordeste 14,3% → 13,3%; SLA humano 4h; WinBack 0,90% → 1,40% na Wave 2) + protocolo do piloto + business case em 3 cenários + </w:t>
+              <w:t xml:space="preserve">Metas do piloto (Nordeste: −1 p.p. sobre o baseline das rotas selecionadas, referência histórica 14,3%; SLA humano 4h; WinBack 0,90% → 1,40% na Wave 2) + protocolo do piloto + business case em 3 cenários + </w:t>
             </w:r>
             <w:r>
               <w:rPr>

</xml_diff>